<commit_message>
Fix SignWell documents never becoming signable: use text tags, not with_signature_page
A live QA send showed with_signature_page: true leaves a document stuck in a
non-standard "Sending" state with no fields ever placed for either recipient
(confirmed via SignWell's own document builder checklist), even after the
dashboard later relabels it "Sent". Switch to SignWell's documented text-tag
mechanism instead: four invisible (white-on-white) markers in the contract
template's Section 11 Signature/Date cells tell SignWell exactly where to
place a real field for each signer, independent of how the regenerated
contract's page layout shifts. Signer numbers (buyer=1, artist=2) are coupled
to recipient order in SignWellProvider.sendForSignature -- both are commented
to be changed together if signing order ever changes.

Co-Authored-By: Claude Sonnet 5 <noreply@anthropic.com>
Claude-Session: https://claude.ai/code/session_01Jk7GX27G3QUrjrk8Q8aCNJ
</commit_message>
<xml_diff>
--- a/src/lib/contract-template/performance-agreement-template.docx
+++ b/src/lib/contract-template/performance-agreement-template.docx
@@ -3348,11 +3348,11 @@
                 <w:rFonts w:ascii="Calibri" w:cs="Calibri" w:eastAsia="Calibri" w:hAnsi="Calibri"/>
                 <w:b w:val="false"/>
                 <w:bCs w:val="false"/>
-                <w:color w:val="1A1A1A"/>
-                <w:sz w:val="18"/>
-                <w:szCs w:val="18"/>
-              </w:rPr>
-              <w:t xml:space="preserve"/>
+                <w:color w:val="FFFFFF"/>
+                <w:sz w:val="18"/>
+                <w:szCs w:val="18"/>
+              </w:rPr>
+              <w:t xml:space="preserve">{artist_rep_signature_tag}</w:t>
             </w:r>
           </w:p>
         </w:tc>
@@ -3413,11 +3413,11 @@
                 <w:rFonts w:ascii="Calibri" w:cs="Calibri" w:eastAsia="Calibri" w:hAnsi="Calibri"/>
                 <w:b w:val="false"/>
                 <w:bCs w:val="false"/>
-                <w:color w:val="1A1A1A"/>
-                <w:sz w:val="18"/>
-                <w:szCs w:val="18"/>
-              </w:rPr>
-              <w:t xml:space="preserve"/>
+                <w:color w:val="FFFFFF"/>
+                <w:sz w:val="18"/>
+                <w:szCs w:val="18"/>
+              </w:rPr>
+              <w:t xml:space="preserve">{purchaser_signature_tag}</w:t>
             </w:r>
           </w:p>
         </w:tc>
@@ -3480,11 +3480,11 @@
                 <w:rFonts w:ascii="Calibri" w:cs="Calibri" w:eastAsia="Calibri" w:hAnsi="Calibri"/>
                 <w:b w:val="false"/>
                 <w:bCs w:val="false"/>
-                <w:color w:val="1A1A1A"/>
-                <w:sz w:val="18"/>
-                <w:szCs w:val="18"/>
-              </w:rPr>
-              <w:t xml:space="preserve"/>
+                <w:color w:val="FFFFFF"/>
+                <w:sz w:val="18"/>
+                <w:szCs w:val="18"/>
+              </w:rPr>
+              <w:t xml:space="preserve">{artist_rep_date_tag}</w:t>
             </w:r>
           </w:p>
         </w:tc>
@@ -3545,11 +3545,11 @@
                 <w:rFonts w:ascii="Calibri" w:cs="Calibri" w:eastAsia="Calibri" w:hAnsi="Calibri"/>
                 <w:b w:val="false"/>
                 <w:bCs w:val="false"/>
-                <w:color w:val="1A1A1A"/>
-                <w:sz w:val="18"/>
-                <w:szCs w:val="18"/>
-              </w:rPr>
-              <w:t xml:space="preserve"/>
+                <w:color w:val="FFFFFF"/>
+                <w:sz w:val="18"/>
+                <w:szCs w:val="18"/>
+              </w:rPr>
+              <w:t xml:space="preserve">{purchaser_date_tag}</w:t>
             </w:r>
           </w:p>
         </w:tc>

</xml_diff>

<commit_message>
Use "The Ridge" / "The Ridge Music Group" throughout the contract template
Greg's ask: the generated Performance Agreement should refer to the
company consistently as "The Ridge Music Group" (and the title heading
as "THE RIDGE MUSIC GROUP"), not "Ridge Music Group" -- matches how the
company is actually referred to elsewhere (email signatures, the site).
Verified by re-running the template through docxtemplater with sample
data and rendering to PDF: all four occurrences (title heading, Section
1 recital, and both sentences in Section 9's agency disclaimer) now read
correctly, and docx structural validation against the prior version
passed with no paragraph-count drift.

Co-Authored-By: Claude Sonnet 5 <noreply@anthropic.com>
Claude-Session: https://claude.ai/code/session_01Jk7GX27G3QUrjrk8Q8aCNJ
</commit_message>
<xml_diff>
--- a/src/lib/contract-template/performance-agreement-template.docx
+++ b/src/lib/contract-template/performance-agreement-template.docx
@@ -16,7 +16,7 @@
           <w:sz w:val="34"/>
           <w:szCs w:val="34"/>
         </w:rPr>
-        <w:t xml:space="preserve">RIDGE MUSIC GROUP</w:t>
+        <w:t xml:space="preserve">THE RIDGE MUSIC GROUP</w:t>
       </w:r>
     </w:p>
     <w:p>
@@ -46,7 +46,7 @@
           <w:sz w:val="20"/>
           <w:szCs w:val="20"/>
         </w:rPr>
-        <w:t xml:space="preserve">This Live Performance Agreement (“Agreement”) is made as of {agreement_date}, by and between {artist_legal_entity} (“Artist”) and {purchaser_name} (“Purchaser”), for the live performance engagement described below (the “Engagement”). Ridge Music Group is acting solely as booking agent for Artist in connection with this Agreement, as further described in Section 9.</w:t>
+        <w:t xml:space="preserve">This Live Performance Agreement (“Agreement”) is made as of {agreement_date}, by and between {artist_legal_entity} (“Artist”) and {purchaser_name} (“Purchaser”), for the live performance engagement described below (the “Engagement”). The Ridge Music Group is acting solely as booking agent for Artist in connection with this Agreement, as further described in Section 9.</w:t>
       </w:r>
     </w:p>
     <w:p>
@@ -2593,7 +2593,7 @@
           <w:sz w:val="20"/>
           <w:szCs w:val="20"/>
         </w:rPr>
-        <w:t xml:space="preserve">Ridge Music Group is acting solely as booking agent for Artist in arranging this Engagement and is not a party to this Agreement. Ridge Music Group, its officers, and its employees assume no liability for the performance or breach of any provision of this Agreement by either Artist or Purchaser.</w:t>
+        <w:t xml:space="preserve">The Ridge Music Group is acting solely as booking agent for Artist in arranging this Engagement and is not a party to this Agreement. The Ridge Music Group, its officers, and its employees assume no liability for the performance or breach of any provision of this Agreement by either Artist or Purchaser.</w:t>
       </w:r>
     </w:p>
     <w:p>

</xml_diff>